<commit_message>
v20: Eva a la UCQ, nadie sin finde y contaje de findes con el 1 y el 2
1. Eva coge la UCQ del 13 y el 15 y Ana pasa a quirofano esos dos dias. Los dos
   dias van emparejados, asi que las UCQ de Ana se mueven juntas: no se puede
   pasar solo una.
2. Nadie se queda sin finde. Miriam (R1) no tenia ninguno dentro del 3-30 y,
   tras el primer arreglo, tampoco Antonio (R2). Ahora los ocho R1 tienen
   exactamente 1 finde y ningun R2 se queda a cero. Cambian los dias 10, 26
   y 28.
3. El contaje de findes incluye el 1 y el 2, igual que ya hacia el de
   localizadas: son el puente del 31 de octubre.

5 dias tocados sobre la v19. check.py sigue dando 0 errores y las mismas 3
normas saltadas a proposito. Word regenerado y verificado celda a celda.

Co-Authored-By: Claude Opus 5 <noreply@anthropic.com>
Claude-Session: https://claude.ai/code/session_016y3GANkwS9e8ZakWBJo924
</commit_message>
<xml_diff>
--- a/projects/guardias-noviembre-2026/Guardias_Noviembre_2026.docx
+++ b/projects/guardias-noviembre-2026/Guardias_Noviembre_2026.docx
@@ -2180,7 +2180,7 @@
                 <w:sz w:val="16"/>
                 <w:szCs w:val="16"/>
               </w:rPr>
-              <w:t xml:space="preserve"> Miriam</w:t>
+              <w:t xml:space="preserve"> David</w:t>
             </w:r>
           </w:p>
           <w:p>
@@ -2654,85 +2654,85 @@
                 <w:sz w:val="16"/>
                 <w:szCs w:val="16"/>
               </w:rPr>
+              <w:t xml:space="preserve"> Eva</w:t>
+            </w:r>
+          </w:p>
+          <w:p>
+            <w:pPr>
+              <w:spacing w:after="0" w:before="8"/>
+            </w:pPr>
+            <w:r>
+              <w:rPr>
+                <w:rFonts w:ascii="Consolas" w:cs="Consolas" w:eastAsia="Consolas" w:hAnsi="Consolas"/>
+                <w:b/>
+                <w:bCs/>
+                <w:color w:val="1F6474"/>
+                <w:sz w:val="13"/>
+                <w:szCs w:val="13"/>
+              </w:rPr>
+              <w:t xml:space="preserve">MAY </w:t>
+            </w:r>
+            <w:r>
+              <w:rPr>
+                <w:i w:val="false"/>
+                <w:iCs w:val="false"/>
+                <w:color w:val="16242B"/>
+                <w:sz w:val="16"/>
+                <w:szCs w:val="16"/>
+              </w:rPr>
+              <w:t xml:space="preserve"> Patri</w:t>
+            </w:r>
+          </w:p>
+          <w:p>
+            <w:pPr>
+              <w:spacing w:after="0" w:before="8"/>
+            </w:pPr>
+            <w:r>
+              <w:rPr>
+                <w:rFonts w:ascii="Consolas" w:cs="Consolas" w:eastAsia="Consolas" w:hAnsi="Consolas"/>
+                <w:b/>
+                <w:bCs/>
+                <w:color w:val="4A5A62"/>
+                <w:sz w:val="13"/>
+                <w:szCs w:val="13"/>
+              </w:rPr>
+              <w:t xml:space="preserve">QX  </w:t>
+            </w:r>
+            <w:r>
+              <w:rPr>
+                <w:i w:val="false"/>
+                <w:iCs w:val="false"/>
+                <w:color w:val="16242B"/>
+                <w:sz w:val="16"/>
+                <w:szCs w:val="16"/>
+              </w:rPr>
+              <w:t xml:space="preserve"> David</w:t>
+            </w:r>
+          </w:p>
+          <w:p>
+            <w:pPr>
+              <w:spacing w:after="0" w:before="8"/>
+            </w:pPr>
+            <w:r>
+              <w:rPr>
+                <w:rFonts w:ascii="Consolas" w:cs="Consolas" w:eastAsia="Consolas" w:hAnsi="Consolas"/>
+                <w:b/>
+                <w:bCs/>
+                <w:color w:val="4A5A62"/>
+                <w:sz w:val="13"/>
+                <w:szCs w:val="13"/>
+              </w:rPr>
+              <w:t xml:space="preserve">QX  </w:t>
+            </w:r>
+            <w:r>
+              <w:rPr>
+                <w:i w:val="false"/>
+                <w:iCs w:val="false"/>
+                <w:color w:val="16242B"/>
+                <w:sz w:val="16"/>
+                <w:szCs w:val="16"/>
+              </w:rPr>
               <w:t xml:space="preserve"> Ana</w:t>
-            </w:r>
-          </w:p>
-          <w:p>
-            <w:pPr>
-              <w:spacing w:after="0" w:before="8"/>
-            </w:pPr>
-            <w:r>
-              <w:rPr>
-                <w:rFonts w:ascii="Consolas" w:cs="Consolas" w:eastAsia="Consolas" w:hAnsi="Consolas"/>
-                <w:b/>
-                <w:bCs/>
-                <w:color w:val="1F6474"/>
-                <w:sz w:val="13"/>
-                <w:szCs w:val="13"/>
-              </w:rPr>
-              <w:t xml:space="preserve">MAY </w:t>
-            </w:r>
-            <w:r>
-              <w:rPr>
-                <w:i w:val="false"/>
-                <w:iCs w:val="false"/>
-                <w:color w:val="16242B"/>
-                <w:sz w:val="16"/>
-                <w:szCs w:val="16"/>
-              </w:rPr>
-              <w:t xml:space="preserve"> Patri</w:t>
-            </w:r>
-          </w:p>
-          <w:p>
-            <w:pPr>
-              <w:spacing w:after="0" w:before="8"/>
-            </w:pPr>
-            <w:r>
-              <w:rPr>
-                <w:rFonts w:ascii="Consolas" w:cs="Consolas" w:eastAsia="Consolas" w:hAnsi="Consolas"/>
-                <w:b/>
-                <w:bCs/>
-                <w:color w:val="4A5A62"/>
-                <w:sz w:val="13"/>
-                <w:szCs w:val="13"/>
-              </w:rPr>
-              <w:t xml:space="preserve">QX  </w:t>
-            </w:r>
-            <w:r>
-              <w:rPr>
-                <w:i w:val="false"/>
-                <w:iCs w:val="false"/>
-                <w:color w:val="16242B"/>
-                <w:sz w:val="16"/>
-                <w:szCs w:val="16"/>
-              </w:rPr>
-              <w:t xml:space="preserve"> David</w:t>
-            </w:r>
-          </w:p>
-          <w:p>
-            <w:pPr>
-              <w:spacing w:after="0" w:before="8"/>
-            </w:pPr>
-            <w:r>
-              <w:rPr>
-                <w:rFonts w:ascii="Consolas" w:cs="Consolas" w:eastAsia="Consolas" w:hAnsi="Consolas"/>
-                <w:b/>
-                <w:bCs/>
-                <w:color w:val="4A5A62"/>
-                <w:sz w:val="13"/>
-                <w:szCs w:val="13"/>
-              </w:rPr>
-              <w:t xml:space="preserve">QX  </w:t>
-            </w:r>
-            <w:r>
-              <w:rPr>
-                <w:i w:val="false"/>
-                <w:iCs w:val="false"/>
-                <w:color w:val="16242B"/>
-                <w:sz w:val="16"/>
-                <w:szCs w:val="16"/>
-              </w:rPr>
-              <w:t xml:space="preserve"> Eva</w:t>
             </w:r>
           </w:p>
         </w:tc>
@@ -3018,85 +3018,85 @@
                 <w:sz w:val="16"/>
                 <w:szCs w:val="16"/>
               </w:rPr>
+              <w:t xml:space="preserve"> Eva</w:t>
+            </w:r>
+          </w:p>
+          <w:p>
+            <w:pPr>
+              <w:spacing w:after="0" w:before="8"/>
+            </w:pPr>
+            <w:r>
+              <w:rPr>
+                <w:rFonts w:ascii="Consolas" w:cs="Consolas" w:eastAsia="Consolas" w:hAnsi="Consolas"/>
+                <w:b/>
+                <w:bCs/>
+                <w:color w:val="1F6474"/>
+                <w:sz w:val="13"/>
+                <w:szCs w:val="13"/>
+              </w:rPr>
+              <w:t xml:space="preserve">MAY </w:t>
+            </w:r>
+            <w:r>
+              <w:rPr>
+                <w:i w:val="false"/>
+                <w:iCs w:val="false"/>
+                <w:color w:val="16242B"/>
+                <w:sz w:val="16"/>
+                <w:szCs w:val="16"/>
+              </w:rPr>
+              <w:t xml:space="preserve"> Patri</w:t>
+            </w:r>
+          </w:p>
+          <w:p>
+            <w:pPr>
+              <w:spacing w:after="0" w:before="8"/>
+            </w:pPr>
+            <w:r>
+              <w:rPr>
+                <w:rFonts w:ascii="Consolas" w:cs="Consolas" w:eastAsia="Consolas" w:hAnsi="Consolas"/>
+                <w:b/>
+                <w:bCs/>
+                <w:color w:val="4A5A62"/>
+                <w:sz w:val="13"/>
+                <w:szCs w:val="13"/>
+              </w:rPr>
+              <w:t xml:space="preserve">QX  </w:t>
+            </w:r>
+            <w:r>
+              <w:rPr>
+                <w:i w:val="false"/>
+                <w:iCs w:val="false"/>
+                <w:color w:val="16242B"/>
+                <w:sz w:val="16"/>
+                <w:szCs w:val="16"/>
+              </w:rPr>
+              <w:t xml:space="preserve"> David</w:t>
+            </w:r>
+          </w:p>
+          <w:p>
+            <w:pPr>
+              <w:spacing w:after="0" w:before="8"/>
+            </w:pPr>
+            <w:r>
+              <w:rPr>
+                <w:rFonts w:ascii="Consolas" w:cs="Consolas" w:eastAsia="Consolas" w:hAnsi="Consolas"/>
+                <w:b/>
+                <w:bCs/>
+                <w:color w:val="4A5A62"/>
+                <w:sz w:val="13"/>
+                <w:szCs w:val="13"/>
+              </w:rPr>
+              <w:t xml:space="preserve">QX  </w:t>
+            </w:r>
+            <w:r>
+              <w:rPr>
+                <w:i w:val="false"/>
+                <w:iCs w:val="false"/>
+                <w:color w:val="16242B"/>
+                <w:sz w:val="16"/>
+                <w:szCs w:val="16"/>
+              </w:rPr>
               <w:t xml:space="preserve"> Ana</w:t>
-            </w:r>
-          </w:p>
-          <w:p>
-            <w:pPr>
-              <w:spacing w:after="0" w:before="8"/>
-            </w:pPr>
-            <w:r>
-              <w:rPr>
-                <w:rFonts w:ascii="Consolas" w:cs="Consolas" w:eastAsia="Consolas" w:hAnsi="Consolas"/>
-                <w:b/>
-                <w:bCs/>
-                <w:color w:val="1F6474"/>
-                <w:sz w:val="13"/>
-                <w:szCs w:val="13"/>
-              </w:rPr>
-              <w:t xml:space="preserve">MAY </w:t>
-            </w:r>
-            <w:r>
-              <w:rPr>
-                <w:i w:val="false"/>
-                <w:iCs w:val="false"/>
-                <w:color w:val="16242B"/>
-                <w:sz w:val="16"/>
-                <w:szCs w:val="16"/>
-              </w:rPr>
-              <w:t xml:space="preserve"> Patri</w:t>
-            </w:r>
-          </w:p>
-          <w:p>
-            <w:pPr>
-              <w:spacing w:after="0" w:before="8"/>
-            </w:pPr>
-            <w:r>
-              <w:rPr>
-                <w:rFonts w:ascii="Consolas" w:cs="Consolas" w:eastAsia="Consolas" w:hAnsi="Consolas"/>
-                <w:b/>
-                <w:bCs/>
-                <w:color w:val="4A5A62"/>
-                <w:sz w:val="13"/>
-                <w:szCs w:val="13"/>
-              </w:rPr>
-              <w:t xml:space="preserve">QX  </w:t>
-            </w:r>
-            <w:r>
-              <w:rPr>
-                <w:i w:val="false"/>
-                <w:iCs w:val="false"/>
-                <w:color w:val="16242B"/>
-                <w:sz w:val="16"/>
-                <w:szCs w:val="16"/>
-              </w:rPr>
-              <w:t xml:space="preserve"> David</w:t>
-            </w:r>
-          </w:p>
-          <w:p>
-            <w:pPr>
-              <w:spacing w:after="0" w:before="8"/>
-            </w:pPr>
-            <w:r>
-              <w:rPr>
-                <w:rFonts w:ascii="Consolas" w:cs="Consolas" w:eastAsia="Consolas" w:hAnsi="Consolas"/>
-                <w:b/>
-                <w:bCs/>
-                <w:color w:val="4A5A62"/>
-                <w:sz w:val="13"/>
-                <w:szCs w:val="13"/>
-              </w:rPr>
-              <w:t xml:space="preserve">QX  </w:t>
-            </w:r>
-            <w:r>
-              <w:rPr>
-                <w:i w:val="false"/>
-                <w:iCs w:val="false"/>
-                <w:color w:val="16242B"/>
-                <w:sz w:val="16"/>
-                <w:szCs w:val="16"/>
-              </w:rPr>
-              <w:t xml:space="preserve"> Eva</w:t>
             </w:r>
           </w:p>
         </w:tc>
@@ -4996,7 +4996,7 @@
                 <w:sz w:val="16"/>
                 <w:szCs w:val="16"/>
               </w:rPr>
-              <w:t xml:space="preserve"> David</w:t>
+              <w:t xml:space="preserve"> Tania</w:t>
             </w:r>
           </w:p>
           <w:p>
@@ -5360,33 +5360,33 @@
                 <w:sz w:val="16"/>
                 <w:szCs w:val="16"/>
               </w:rPr>
+              <w:t xml:space="preserve"> Miriam</w:t>
+            </w:r>
+          </w:p>
+          <w:p>
+            <w:pPr>
+              <w:spacing w:after="0" w:before="8"/>
+            </w:pPr>
+            <w:r>
+              <w:rPr>
+                <w:rFonts w:ascii="Consolas" w:cs="Consolas" w:eastAsia="Consolas" w:hAnsi="Consolas"/>
+                <w:b/>
+                <w:bCs/>
+                <w:color w:val="4A5A62"/>
+                <w:sz w:val="13"/>
+                <w:szCs w:val="13"/>
+              </w:rPr>
+              <w:t xml:space="preserve">QX  </w:t>
+            </w:r>
+            <w:r>
+              <w:rPr>
+                <w:i w:val="false"/>
+                <w:iCs w:val="false"/>
+                <w:color w:val="16242B"/>
+                <w:sz w:val="16"/>
+                <w:szCs w:val="16"/>
+              </w:rPr>
               <w:t xml:space="preserve"> Antonio</w:t>
-            </w:r>
-          </w:p>
-          <w:p>
-            <w:pPr>
-              <w:spacing w:after="0" w:before="8"/>
-            </w:pPr>
-            <w:r>
-              <w:rPr>
-                <w:rFonts w:ascii="Consolas" w:cs="Consolas" w:eastAsia="Consolas" w:hAnsi="Consolas"/>
-                <w:b/>
-                <w:bCs/>
-                <w:color w:val="4A5A62"/>
-                <w:sz w:val="13"/>
-                <w:szCs w:val="13"/>
-              </w:rPr>
-              <w:t xml:space="preserve">QX  </w:t>
-            </w:r>
-            <w:r>
-              <w:rPr>
-                <w:i w:val="false"/>
-                <w:iCs w:val="false"/>
-                <w:color w:val="16242B"/>
-                <w:sz w:val="16"/>
-                <w:szCs w:val="16"/>
-              </w:rPr>
-              <w:t xml:space="preserve"> Tania</w:t>
             </w:r>
           </w:p>
         </w:tc>
@@ -6240,7 +6240,7 @@
                 <w:sz w:val="18"/>
                 <w:szCs w:val="18"/>
               </w:rPr>
-              <w:t xml:space="preserve">1</w:t>
+              <w:t xml:space="preserve">2</w:t>
             </w:r>
           </w:p>
         </w:tc>
@@ -6992,7 +6992,7 @@
                 <w:sz w:val="18"/>
                 <w:szCs w:val="18"/>
               </w:rPr>
-              <w:t xml:space="preserve">1</w:t>
+              <w:t xml:space="preserve">2</w:t>
             </w:r>
           </w:p>
         </w:tc>
@@ -7180,7 +7180,7 @@
                 <w:sz w:val="18"/>
                 <w:szCs w:val="18"/>
               </w:rPr>
-              <w:t xml:space="preserve">1</w:t>
+              <w:t xml:space="preserve">2</w:t>
             </w:r>
           </w:p>
         </w:tc>
@@ -7556,7 +7556,7 @@
                 <w:sz w:val="18"/>
                 <w:szCs w:val="18"/>
               </w:rPr>
-              <w:t xml:space="preserve">0</w:t>
+              <w:t xml:space="preserve">2</w:t>
             </w:r>
           </w:p>
         </w:tc>
@@ -7744,7 +7744,7 @@
                 <w:sz w:val="18"/>
                 <w:szCs w:val="18"/>
               </w:rPr>
-              <w:t xml:space="preserve">1</w:t>
+              <w:t xml:space="preserve">2</w:t>
             </w:r>
           </w:p>
         </w:tc>
@@ -9436,7 +9436,7 @@
                 <w:sz w:val="18"/>
                 <w:szCs w:val="18"/>
               </w:rPr>
-              <w:t xml:space="preserve">2</w:t>
+              <w:t xml:space="preserve">3</w:t>
             </w:r>
           </w:p>
         </w:tc>
@@ -10752,7 +10752,7 @@
                 <w:sz w:val="18"/>
                 <w:szCs w:val="18"/>
               </w:rPr>
-              <w:t xml:space="preserve">1</w:t>
+              <w:t xml:space="preserve">2</w:t>
             </w:r>
           </w:p>
         </w:tc>

</xml_diff>

<commit_message>
v21: deshacer los cambios de Ana/Eva y de Miriam
Vuelven a Ana las UCQ del 13 y el 15, y Miriam vuelve al 10, 16 y 19. Con ello
vuelven tambien los dias 10, 26 y 28. El cuadrante queda exactamente como en la
v18/v19.

Se mantiene el contaje de findes incluyendo el 1 y el 2, que son el puente del
31 de octubre, igual que ya hacia el de localizadas.

check.py da 0 errores y las mismas 3 normas saltadas a proposito. Word
regenerado y verificado celda a celda.

Co-Authored-By: Claude Opus 5 <noreply@anthropic.com>
Claude-Session: https://claude.ai/code/session_016y3GANkwS9e8ZakWBJo924
</commit_message>
<xml_diff>
--- a/projects/guardias-noviembre-2026/Guardias_Noviembre_2026.docx
+++ b/projects/guardias-noviembre-2026/Guardias_Noviembre_2026.docx
@@ -2180,7 +2180,7 @@
                 <w:sz w:val="16"/>
                 <w:szCs w:val="16"/>
               </w:rPr>
-              <w:t xml:space="preserve"> David</w:t>
+              <w:t xml:space="preserve"> Miriam</w:t>
             </w:r>
           </w:p>
           <w:p>
@@ -2654,85 +2654,85 @@
                 <w:sz w:val="16"/>
                 <w:szCs w:val="16"/>
               </w:rPr>
+              <w:t xml:space="preserve"> Ana</w:t>
+            </w:r>
+          </w:p>
+          <w:p>
+            <w:pPr>
+              <w:spacing w:after="0" w:before="8"/>
+            </w:pPr>
+            <w:r>
+              <w:rPr>
+                <w:rFonts w:ascii="Consolas" w:cs="Consolas" w:eastAsia="Consolas" w:hAnsi="Consolas"/>
+                <w:b/>
+                <w:bCs/>
+                <w:color w:val="1F6474"/>
+                <w:sz w:val="13"/>
+                <w:szCs w:val="13"/>
+              </w:rPr>
+              <w:t xml:space="preserve">MAY </w:t>
+            </w:r>
+            <w:r>
+              <w:rPr>
+                <w:i w:val="false"/>
+                <w:iCs w:val="false"/>
+                <w:color w:val="16242B"/>
+                <w:sz w:val="16"/>
+                <w:szCs w:val="16"/>
+              </w:rPr>
+              <w:t xml:space="preserve"> Patri</w:t>
+            </w:r>
+          </w:p>
+          <w:p>
+            <w:pPr>
+              <w:spacing w:after="0" w:before="8"/>
+            </w:pPr>
+            <w:r>
+              <w:rPr>
+                <w:rFonts w:ascii="Consolas" w:cs="Consolas" w:eastAsia="Consolas" w:hAnsi="Consolas"/>
+                <w:b/>
+                <w:bCs/>
+                <w:color w:val="4A5A62"/>
+                <w:sz w:val="13"/>
+                <w:szCs w:val="13"/>
+              </w:rPr>
+              <w:t xml:space="preserve">QX  </w:t>
+            </w:r>
+            <w:r>
+              <w:rPr>
+                <w:i w:val="false"/>
+                <w:iCs w:val="false"/>
+                <w:color w:val="16242B"/>
+                <w:sz w:val="16"/>
+                <w:szCs w:val="16"/>
+              </w:rPr>
+              <w:t xml:space="preserve"> David</w:t>
+            </w:r>
+          </w:p>
+          <w:p>
+            <w:pPr>
+              <w:spacing w:after="0" w:before="8"/>
+            </w:pPr>
+            <w:r>
+              <w:rPr>
+                <w:rFonts w:ascii="Consolas" w:cs="Consolas" w:eastAsia="Consolas" w:hAnsi="Consolas"/>
+                <w:b/>
+                <w:bCs/>
+                <w:color w:val="4A5A62"/>
+                <w:sz w:val="13"/>
+                <w:szCs w:val="13"/>
+              </w:rPr>
+              <w:t xml:space="preserve">QX  </w:t>
+            </w:r>
+            <w:r>
+              <w:rPr>
+                <w:i w:val="false"/>
+                <w:iCs w:val="false"/>
+                <w:color w:val="16242B"/>
+                <w:sz w:val="16"/>
+                <w:szCs w:val="16"/>
+              </w:rPr>
               <w:t xml:space="preserve"> Eva</w:t>
-            </w:r>
-          </w:p>
-          <w:p>
-            <w:pPr>
-              <w:spacing w:after="0" w:before="8"/>
-            </w:pPr>
-            <w:r>
-              <w:rPr>
-                <w:rFonts w:ascii="Consolas" w:cs="Consolas" w:eastAsia="Consolas" w:hAnsi="Consolas"/>
-                <w:b/>
-                <w:bCs/>
-                <w:color w:val="1F6474"/>
-                <w:sz w:val="13"/>
-                <w:szCs w:val="13"/>
-              </w:rPr>
-              <w:t xml:space="preserve">MAY </w:t>
-            </w:r>
-            <w:r>
-              <w:rPr>
-                <w:i w:val="false"/>
-                <w:iCs w:val="false"/>
-                <w:color w:val="16242B"/>
-                <w:sz w:val="16"/>
-                <w:szCs w:val="16"/>
-              </w:rPr>
-              <w:t xml:space="preserve"> Patri</w:t>
-            </w:r>
-          </w:p>
-          <w:p>
-            <w:pPr>
-              <w:spacing w:after="0" w:before="8"/>
-            </w:pPr>
-            <w:r>
-              <w:rPr>
-                <w:rFonts w:ascii="Consolas" w:cs="Consolas" w:eastAsia="Consolas" w:hAnsi="Consolas"/>
-                <w:b/>
-                <w:bCs/>
-                <w:color w:val="4A5A62"/>
-                <w:sz w:val="13"/>
-                <w:szCs w:val="13"/>
-              </w:rPr>
-              <w:t xml:space="preserve">QX  </w:t>
-            </w:r>
-            <w:r>
-              <w:rPr>
-                <w:i w:val="false"/>
-                <w:iCs w:val="false"/>
-                <w:color w:val="16242B"/>
-                <w:sz w:val="16"/>
-                <w:szCs w:val="16"/>
-              </w:rPr>
-              <w:t xml:space="preserve"> David</w:t>
-            </w:r>
-          </w:p>
-          <w:p>
-            <w:pPr>
-              <w:spacing w:after="0" w:before="8"/>
-            </w:pPr>
-            <w:r>
-              <w:rPr>
-                <w:rFonts w:ascii="Consolas" w:cs="Consolas" w:eastAsia="Consolas" w:hAnsi="Consolas"/>
-                <w:b/>
-                <w:bCs/>
-                <w:color w:val="4A5A62"/>
-                <w:sz w:val="13"/>
-                <w:szCs w:val="13"/>
-              </w:rPr>
-              <w:t xml:space="preserve">QX  </w:t>
-            </w:r>
-            <w:r>
-              <w:rPr>
-                <w:i w:val="false"/>
-                <w:iCs w:val="false"/>
-                <w:color w:val="16242B"/>
-                <w:sz w:val="16"/>
-                <w:szCs w:val="16"/>
-              </w:rPr>
-              <w:t xml:space="preserve"> Ana</w:t>
             </w:r>
           </w:p>
         </w:tc>
@@ -3018,85 +3018,85 @@
                 <w:sz w:val="16"/>
                 <w:szCs w:val="16"/>
               </w:rPr>
+              <w:t xml:space="preserve"> Ana</w:t>
+            </w:r>
+          </w:p>
+          <w:p>
+            <w:pPr>
+              <w:spacing w:after="0" w:before="8"/>
+            </w:pPr>
+            <w:r>
+              <w:rPr>
+                <w:rFonts w:ascii="Consolas" w:cs="Consolas" w:eastAsia="Consolas" w:hAnsi="Consolas"/>
+                <w:b/>
+                <w:bCs/>
+                <w:color w:val="1F6474"/>
+                <w:sz w:val="13"/>
+                <w:szCs w:val="13"/>
+              </w:rPr>
+              <w:t xml:space="preserve">MAY </w:t>
+            </w:r>
+            <w:r>
+              <w:rPr>
+                <w:i w:val="false"/>
+                <w:iCs w:val="false"/>
+                <w:color w:val="16242B"/>
+                <w:sz w:val="16"/>
+                <w:szCs w:val="16"/>
+              </w:rPr>
+              <w:t xml:space="preserve"> Patri</w:t>
+            </w:r>
+          </w:p>
+          <w:p>
+            <w:pPr>
+              <w:spacing w:after="0" w:before="8"/>
+            </w:pPr>
+            <w:r>
+              <w:rPr>
+                <w:rFonts w:ascii="Consolas" w:cs="Consolas" w:eastAsia="Consolas" w:hAnsi="Consolas"/>
+                <w:b/>
+                <w:bCs/>
+                <w:color w:val="4A5A62"/>
+                <w:sz w:val="13"/>
+                <w:szCs w:val="13"/>
+              </w:rPr>
+              <w:t xml:space="preserve">QX  </w:t>
+            </w:r>
+            <w:r>
+              <w:rPr>
+                <w:i w:val="false"/>
+                <w:iCs w:val="false"/>
+                <w:color w:val="16242B"/>
+                <w:sz w:val="16"/>
+                <w:szCs w:val="16"/>
+              </w:rPr>
+              <w:t xml:space="preserve"> David</w:t>
+            </w:r>
+          </w:p>
+          <w:p>
+            <w:pPr>
+              <w:spacing w:after="0" w:before="8"/>
+            </w:pPr>
+            <w:r>
+              <w:rPr>
+                <w:rFonts w:ascii="Consolas" w:cs="Consolas" w:eastAsia="Consolas" w:hAnsi="Consolas"/>
+                <w:b/>
+                <w:bCs/>
+                <w:color w:val="4A5A62"/>
+                <w:sz w:val="13"/>
+                <w:szCs w:val="13"/>
+              </w:rPr>
+              <w:t xml:space="preserve">QX  </w:t>
+            </w:r>
+            <w:r>
+              <w:rPr>
+                <w:i w:val="false"/>
+                <w:iCs w:val="false"/>
+                <w:color w:val="16242B"/>
+                <w:sz w:val="16"/>
+                <w:szCs w:val="16"/>
+              </w:rPr>
               <w:t xml:space="preserve"> Eva</w:t>
-            </w:r>
-          </w:p>
-          <w:p>
-            <w:pPr>
-              <w:spacing w:after="0" w:before="8"/>
-            </w:pPr>
-            <w:r>
-              <w:rPr>
-                <w:rFonts w:ascii="Consolas" w:cs="Consolas" w:eastAsia="Consolas" w:hAnsi="Consolas"/>
-                <w:b/>
-                <w:bCs/>
-                <w:color w:val="1F6474"/>
-                <w:sz w:val="13"/>
-                <w:szCs w:val="13"/>
-              </w:rPr>
-              <w:t xml:space="preserve">MAY </w:t>
-            </w:r>
-            <w:r>
-              <w:rPr>
-                <w:i w:val="false"/>
-                <w:iCs w:val="false"/>
-                <w:color w:val="16242B"/>
-                <w:sz w:val="16"/>
-                <w:szCs w:val="16"/>
-              </w:rPr>
-              <w:t xml:space="preserve"> Patri</w:t>
-            </w:r>
-          </w:p>
-          <w:p>
-            <w:pPr>
-              <w:spacing w:after="0" w:before="8"/>
-            </w:pPr>
-            <w:r>
-              <w:rPr>
-                <w:rFonts w:ascii="Consolas" w:cs="Consolas" w:eastAsia="Consolas" w:hAnsi="Consolas"/>
-                <w:b/>
-                <w:bCs/>
-                <w:color w:val="4A5A62"/>
-                <w:sz w:val="13"/>
-                <w:szCs w:val="13"/>
-              </w:rPr>
-              <w:t xml:space="preserve">QX  </w:t>
-            </w:r>
-            <w:r>
-              <w:rPr>
-                <w:i w:val="false"/>
-                <w:iCs w:val="false"/>
-                <w:color w:val="16242B"/>
-                <w:sz w:val="16"/>
-                <w:szCs w:val="16"/>
-              </w:rPr>
-              <w:t xml:space="preserve"> David</w:t>
-            </w:r>
-          </w:p>
-          <w:p>
-            <w:pPr>
-              <w:spacing w:after="0" w:before="8"/>
-            </w:pPr>
-            <w:r>
-              <w:rPr>
-                <w:rFonts w:ascii="Consolas" w:cs="Consolas" w:eastAsia="Consolas" w:hAnsi="Consolas"/>
-                <w:b/>
-                <w:bCs/>
-                <w:color w:val="4A5A62"/>
-                <w:sz w:val="13"/>
-                <w:szCs w:val="13"/>
-              </w:rPr>
-              <w:t xml:space="preserve">QX  </w:t>
-            </w:r>
-            <w:r>
-              <w:rPr>
-                <w:i w:val="false"/>
-                <w:iCs w:val="false"/>
-                <w:color w:val="16242B"/>
-                <w:sz w:val="16"/>
-                <w:szCs w:val="16"/>
-              </w:rPr>
-              <w:t xml:space="preserve"> Ana</w:t>
             </w:r>
           </w:p>
         </w:tc>
@@ -4996,7 +4996,7 @@
                 <w:sz w:val="16"/>
                 <w:szCs w:val="16"/>
               </w:rPr>
-              <w:t xml:space="preserve"> Tania</w:t>
+              <w:t xml:space="preserve"> David</w:t>
             </w:r>
           </w:p>
           <w:p>
@@ -5360,7 +5360,7 @@
                 <w:sz w:val="16"/>
                 <w:szCs w:val="16"/>
               </w:rPr>
-              <w:t xml:space="preserve"> Miriam</w:t>
+              <w:t xml:space="preserve"> Antonio</w:t>
             </w:r>
           </w:p>
           <w:p>
@@ -5386,7 +5386,7 @@
                 <w:sz w:val="16"/>
                 <w:szCs w:val="16"/>
               </w:rPr>
-              <w:t xml:space="preserve"> Antonio</w:t>
+              <w:t xml:space="preserve"> Tania</w:t>
             </w:r>
           </w:p>
         </w:tc>
@@ -7556,7 +7556,7 @@
                 <w:sz w:val="18"/>
                 <w:szCs w:val="18"/>
               </w:rPr>
-              <w:t xml:space="preserve">2</w:t>
+              <w:t xml:space="preserve">1</w:t>
             </w:r>
           </w:p>
         </w:tc>
@@ -8872,7 +8872,7 @@
                 <w:sz w:val="18"/>
                 <w:szCs w:val="18"/>
               </w:rPr>
-              <w:t xml:space="preserve">2</w:t>
+              <w:t xml:space="preserve">3</w:t>
             </w:r>
           </w:p>
         </w:tc>

</xml_diff>

<commit_message>
v24: el doblete viernes-domingo lo llevan Almudena, Sandra e Isabel
Tania sale del 6 y del 8. Las tres R4 cubren los dos dias, con AnaG de
trasplante y Carlota en UCQ, asi que el 6 y el 8 son las mismas cinco personas:
sin relevos, solo se intercambian los puestos. Ni un R1 ni un R2 en ninguno de
los dos dias, asi que la libranza de la fiesta queda entera. Tania pasa al 5,
12, 17 y 28.

Coste: Almudena vuelve a 3/3 puentes, porque ahora trabaja el domingo 8. En la
v23 solo hacia el viernes 6, que no es dia de puente. Vuelven a ser 4 las normas
saltadas a proposito, todas autorizadas.

Cambian 5 dias (8, 10, 12, 17 y 18). Localizadas y cargas sin cambios.
1 doblete. check.py da 0 errores. Word regenerado y verificado celda a celda.

Co-Authored-By: Claude Opus 5 <noreply@anthropic.com>
Claude-Session: https://claude.ai/code/session_016y3GANkwS9e8ZakWBJo924
</commit_message>
<xml_diff>
--- a/projects/guardias-noviembre-2026/Guardias_Noviembre_2026.docx
+++ b/projects/guardias-noviembre-2026/Guardias_Noviembre_2026.docx
@@ -1824,7 +1824,7 @@
                 <w:sz w:val="16"/>
                 <w:szCs w:val="16"/>
               </w:rPr>
-              <w:t xml:space="preserve"> Tania</w:t>
+              <w:t xml:space="preserve"> Almudena</w:t>
             </w:r>
           </w:p>
           <w:p>
@@ -2154,7 +2154,7 @@
                 <w:sz w:val="16"/>
                 <w:szCs w:val="16"/>
               </w:rPr>
-              <w:t xml:space="preserve"> Almudena</w:t>
+              <w:t xml:space="preserve"> Fabián</w:t>
             </w:r>
           </w:p>
           <w:p>
@@ -2550,7 +2550,7 @@
                 <w:sz w:val="16"/>
                 <w:szCs w:val="16"/>
               </w:rPr>
-              <w:t xml:space="preserve"> Rosario</w:t>
+              <w:t xml:space="preserve"> Tania</w:t>
             </w:r>
           </w:p>
         </w:tc>
@@ -3390,7 +3390,7 @@
                 <w:sz w:val="16"/>
                 <w:szCs w:val="16"/>
               </w:rPr>
-              <w:t xml:space="preserve"> Fabián</w:t>
+              <w:t xml:space="preserve"> Almudena</w:t>
             </w:r>
           </w:p>
           <w:p>
@@ -3588,33 +3588,33 @@
                 <w:sz w:val="16"/>
                 <w:szCs w:val="16"/>
               </w:rPr>
+              <w:t xml:space="preserve"> Rosario</w:t>
+            </w:r>
+          </w:p>
+          <w:p>
+            <w:pPr>
+              <w:spacing w:after="0" w:before="8"/>
+            </w:pPr>
+            <w:r>
+              <w:rPr>
+                <w:rFonts w:ascii="Consolas" w:cs="Consolas" w:eastAsia="Consolas" w:hAnsi="Consolas"/>
+                <w:b/>
+                <w:bCs/>
+                <w:color w:val="4A5A62"/>
+                <w:sz w:val="13"/>
+                <w:szCs w:val="13"/>
+              </w:rPr>
+              <w:t xml:space="preserve">QX  </w:t>
+            </w:r>
+            <w:r>
+              <w:rPr>
+                <w:i w:val="false"/>
+                <w:iCs w:val="false"/>
+                <w:color w:val="16242B"/>
+                <w:sz w:val="16"/>
+                <w:szCs w:val="16"/>
+              </w:rPr>
               <w:t xml:space="preserve"> Ana</w:t>
-            </w:r>
-          </w:p>
-          <w:p>
-            <w:pPr>
-              <w:spacing w:after="0" w:before="8"/>
-            </w:pPr>
-            <w:r>
-              <w:rPr>
-                <w:rFonts w:ascii="Consolas" w:cs="Consolas" w:eastAsia="Consolas" w:hAnsi="Consolas"/>
-                <w:b/>
-                <w:bCs/>
-                <w:color w:val="4A5A62"/>
-                <w:sz w:val="13"/>
-                <w:szCs w:val="13"/>
-              </w:rPr>
-              <w:t xml:space="preserve">QX  </w:t>
-            </w:r>
-            <w:r>
-              <w:rPr>
-                <w:i w:val="false"/>
-                <w:iCs w:val="false"/>
-                <w:color w:val="16242B"/>
-                <w:sz w:val="16"/>
-                <w:szCs w:val="16"/>
-              </w:rPr>
-              <w:t xml:space="preserve"> Almudena</w:t>
             </w:r>
           </w:p>
         </w:tc>
@@ -8872,7 +8872,7 @@
                 <w:sz w:val="18"/>
                 <w:szCs w:val="18"/>
               </w:rPr>
-              <w:t xml:space="preserve">3</w:t>
+              <w:t xml:space="preserve">2</w:t>
             </w:r>
           </w:p>
         </w:tc>

</xml_diff>

<commit_message>
v25: igualar los findes acumulados de los R2
Marc no puede coger el sabado 28: tiene el 27, el 28 y el 29 de vacaciones. El
reequilibrio se hace con otro finde:

- Tania sale de todos los findes de noviembre y pasa a 5, 10, 17 y 24, todos
  entre semana. Mantiene sus 4 guardias y su acumulado de findes baja de 4 a 3.
- Marc hace dos findes, el de la fiesta (7 y 9) y el sabado 21. Pasa a 4, 7, 9
  y 21, tambien con 4 guardias, y su acumulado sube de 2 a 3.
- De rebote Emilio baja de 2 findes a 1 y su acumulado queda en 3.

Siete de los ocho R2 quedan a 3 findes acumulados y solo Eva a 4; antes el
abanico iba de 2 a 4.

Cambian 7 dias (10, 12, 16, 18, 21, 24 y 28). El puente y las localizadas no se
tocan. check.py da 0 errores. Word regenerado y verificado celda a celda.

Co-Authored-By: Claude Opus 5 <noreply@anthropic.com>
Claude-Session: https://claude.ai/code/session_016y3GANkwS9e8ZakWBJo924
</commit_message>
<xml_diff>
--- a/projects/guardias-noviembre-2026/Guardias_Noviembre_2026.docx
+++ b/projects/guardias-noviembre-2026/Guardias_Noviembre_2026.docx
@@ -2180,7 +2180,7 @@
                 <w:sz w:val="16"/>
                 <w:szCs w:val="16"/>
               </w:rPr>
-              <w:t xml:space="preserve"> Miriam</w:t>
+              <w:t xml:space="preserve"> Emilio</w:t>
             </w:r>
           </w:p>
           <w:p>
@@ -2206,7 +2206,7 @@
                 <w:sz w:val="16"/>
                 <w:szCs w:val="16"/>
               </w:rPr>
-              <w:t xml:space="preserve"> Emilio</w:t>
+              <w:t xml:space="preserve"> Tania</w:t>
             </w:r>
           </w:p>
         </w:tc>
@@ -2550,7 +2550,7 @@
                 <w:sz w:val="16"/>
                 <w:szCs w:val="16"/>
               </w:rPr>
-              <w:t xml:space="preserve"> Tania</w:t>
+              <w:t xml:space="preserve"> Rosario</w:t>
             </w:r>
           </w:p>
         </w:tc>
@@ -3270,7 +3270,7 @@
                 <w:sz w:val="16"/>
                 <w:szCs w:val="16"/>
               </w:rPr>
-              <w:t xml:space="preserve"> Marc</w:t>
+              <w:t xml:space="preserve"> Emilio</w:t>
             </w:r>
           </w:p>
         </w:tc>
@@ -3588,7 +3588,7 @@
                 <w:sz w:val="16"/>
                 <w:szCs w:val="16"/>
               </w:rPr>
-              <w:t xml:space="preserve"> Rosario</w:t>
+              <w:t xml:space="preserve"> Aitor</w:t>
             </w:r>
           </w:p>
           <w:p>
@@ -4150,7 +4150,7 @@
                 <w:sz w:val="16"/>
                 <w:szCs w:val="16"/>
               </w:rPr>
-              <w:t xml:space="preserve"> Emilio</w:t>
+              <w:t xml:space="preserve"> Marc</w:t>
             </w:r>
           </w:p>
         </w:tc>
@@ -4652,7 +4652,7 @@
                 <w:sz w:val="16"/>
                 <w:szCs w:val="16"/>
               </w:rPr>
-              <w:t xml:space="preserve"> Aitor</w:t>
+              <w:t xml:space="preserve"> Eva</w:t>
             </w:r>
           </w:p>
           <w:p>
@@ -4678,7 +4678,7 @@
                 <w:sz w:val="16"/>
                 <w:szCs w:val="16"/>
               </w:rPr>
-              <w:t xml:space="preserve"> Eva</w:t>
+              <w:t xml:space="preserve"> Tania</w:t>
             </w:r>
           </w:p>
         </w:tc>
@@ -5360,33 +5360,33 @@
                 <w:sz w:val="16"/>
                 <w:szCs w:val="16"/>
               </w:rPr>
+              <w:t xml:space="preserve"> Miriam</w:t>
+            </w:r>
+          </w:p>
+          <w:p>
+            <w:pPr>
+              <w:spacing w:after="0" w:before="8"/>
+            </w:pPr>
+            <w:r>
+              <w:rPr>
+                <w:rFonts w:ascii="Consolas" w:cs="Consolas" w:eastAsia="Consolas" w:hAnsi="Consolas"/>
+                <w:b/>
+                <w:bCs/>
+                <w:color w:val="4A5A62"/>
+                <w:sz w:val="13"/>
+                <w:szCs w:val="13"/>
+              </w:rPr>
+              <w:t xml:space="preserve">QX  </w:t>
+            </w:r>
+            <w:r>
+              <w:rPr>
+                <w:i w:val="false"/>
+                <w:iCs w:val="false"/>
+                <w:color w:val="16242B"/>
+                <w:sz w:val="16"/>
+                <w:szCs w:val="16"/>
+              </w:rPr>
               <w:t xml:space="preserve"> Antonio</w:t>
-            </w:r>
-          </w:p>
-          <w:p>
-            <w:pPr>
-              <w:spacing w:after="0" w:before="8"/>
-            </w:pPr>
-            <w:r>
-              <w:rPr>
-                <w:rFonts w:ascii="Consolas" w:cs="Consolas" w:eastAsia="Consolas" w:hAnsi="Consolas"/>
-                <w:b/>
-                <w:bCs/>
-                <w:color w:val="4A5A62"/>
-                <w:sz w:val="13"/>
-                <w:szCs w:val="13"/>
-              </w:rPr>
-              <w:t xml:space="preserve">QX  </w:t>
-            </w:r>
-            <w:r>
-              <w:rPr>
-                <w:i w:val="false"/>
-                <w:iCs w:val="false"/>
-                <w:color w:val="16242B"/>
-                <w:sz w:val="16"/>
-                <w:szCs w:val="16"/>
-              </w:rPr>
-              <w:t xml:space="preserve"> Tania</w:t>
             </w:r>
           </w:p>
         </w:tc>
@@ -7556,7 +7556,7 @@
                 <w:sz w:val="18"/>
                 <w:szCs w:val="18"/>
               </w:rPr>
-              <w:t xml:space="preserve">1</w:t>
+              <w:t xml:space="preserve">2</w:t>
             </w:r>
           </w:p>
         </w:tc>
@@ -8496,7 +8496,7 @@
                 <w:sz w:val="18"/>
                 <w:szCs w:val="18"/>
               </w:rPr>
-              <w:t xml:space="preserve">2</w:t>
+              <w:t xml:space="preserve">1</w:t>
             </w:r>
           </w:p>
         </w:tc>
@@ -8872,7 +8872,7 @@
                 <w:sz w:val="18"/>
                 <w:szCs w:val="18"/>
               </w:rPr>
-              <w:t xml:space="preserve">2</w:t>
+              <w:t xml:space="preserve">1</w:t>
             </w:r>
           </w:p>
         </w:tc>
@@ -9060,7 +9060,7 @@
                 <w:sz w:val="18"/>
                 <w:szCs w:val="18"/>
               </w:rPr>
-              <w:t xml:space="preserve">1</w:t>
+              <w:t xml:space="preserve">2</w:t>
             </w:r>
           </w:p>
         </w:tc>

</xml_diff>